<commit_message>
Restore sample.docx (test session had polluted it with a stray chat instruction)
</commit_message>
<xml_diff>
--- a/sample.docx
+++ b/sample.docx
@@ -1,7 +1,8 @@
 
 <file path=word/document.xml><?xml version="1.0" encoding="utf-8"?>
-<w:document xmlns:wpc="http://schemas.microsoft.com/office/word/2010/wordprocessingCanvas" xmlns:mc="http://schemas.openxmlformats.org/markup-compatibility/2006" xmlns:o="urn:schemas-microsoft-com:office:office" xmlns:r="http://schemas.openxmlformats.org/officeDocument/2006/relationships" xmlns:m="http://schemas.openxmlformats.org/officeDocument/2006/math" xmlns:v="urn:schemas-microsoft-com:vml" xmlns:wp14="http://schemas.microsoft.com/office/word/2010/wordprocessingDrawing" xmlns:wp="http://schemas.openxmlformats.org/drawingml/2006/wordprocessingDrawing" xmlns:w10="urn:schemas-microsoft-com:office:word" xmlns:w="http://schemas.openxmlformats.org/wordprocessingml/2006/main" xmlns:w14="http://schemas.microsoft.com/office/word/2010/wordml" xmlns:w15="http://schemas.microsoft.com/office/word/2012/wordml" xmlns:wpg="http://schemas.microsoft.com/office/word/2010/wordprocessingGroup" xmlns:wps="http://schemas.microsoft.com/office/word/2010/wordprocessingShape" mc:Ignorable="w14 w15 wp14">
+<w:document xmlns:w="http://schemas.openxmlformats.org/wordprocessingml/2006/main" xmlns:m="http://schemas.openxmlformats.org/officeDocument/2006/math" xmlns:r="http://schemas.openxmlformats.org/officeDocument/2006/relationships" xmlns:o="urn:schemas-microsoft-com:office:office" xmlns:v="urn:schemas-microsoft-com:vml" xmlns:w10="urn:schemas-microsoft-com:office:word" xmlns:a="http://schemas.openxmlformats.org/drawingml/2006/main" xmlns:pic="http://schemas.openxmlformats.org/drawingml/2006/picture" xmlns:wp="http://schemas.openxmlformats.org/drawingml/2006/wordprocessingDrawing">
   <w:body>
+    <w:bookmarkStart w:id="11" w:name="docpilot-소개"/>
     <w:p>
       <w:pPr>
         <w:pStyle w:val="Heading1"/>
@@ -18,6 +19,7 @@
         <w:t xml:space="preserve">docpilot은 문서를 위한 Cursor다. 파일 하나를 계속 붙잡고, 문장이나 문단을 선택해서 AI에게 수정시키는 편집기다.</w:t>
       </w:r>
     </w:p>
+    <w:bookmarkStart w:id="9" w:name="어떻게-쓰나"/>
     <w:p>
       <w:pPr>
         <w:pStyle w:val="Heading2"/>
@@ -31,7 +33,19 @@
         <w:pStyle w:val="FirstParagraph"/>
       </w:pPr>
       <w:r>
-        <w:t xml:space="preserve">본문에서 고치고 싶은 문장을 드래그한 다음 ⌘K를 누른다. 그러면 작은 입력창이 뜨고, 거기에 “더 간결하게” 같은 지시를 적으면 된다. AI가 선택한 부분만 새로 써서 보여주고, 마음에 들면 수락한다.</w:t>
+        <w:t xml:space="preserve">본문에서 고치고 싶은 문장을 드래그한 다음 ⌘K를 누른다. 그러면 작은 입력창이 뜨고, 거기에</w:t>
+      </w:r>
+      <w:r>
+        <w:t xml:space="preserve"> </w:t>
+      </w:r>
+      <w:r>
+        <w:t xml:space="preserve">“더 간결하게”</w:t>
+      </w:r>
+      <w:r>
+        <w:t xml:space="preserve"> </w:t>
+      </w:r>
+      <w:r>
+        <w:t xml:space="preserve">같은 지시를 적으면 된다. AI가 선택한 부분만 새로 써서 보여주고, 마음에 들면 수락한다.</w:t>
       </w:r>
     </w:p>
     <w:p>
@@ -42,6 +56,8 @@
         <w:t xml:space="preserve">오른쪽 패널에서는 문서 전체에 대해 자유롭게 질문할 수 있다. 제목 추천을 받거나, 구조에 대한 조언을 구하는 식이다.</w:t>
       </w:r>
     </w:p>
+    <w:bookmarkEnd w:id="9"/>
+    <w:bookmarkStart w:id="10" w:name="왜-만들었나"/>
     <w:p>
       <w:pPr>
         <w:pStyle w:val="Heading2"/>
@@ -63,9 +79,20 @@
         <w:pStyle w:val="BodyText"/>
       </w:pPr>
       <w:r>
-        <w:t>Docpilot 우리 코드 잘 보고, 제대로 개선 계획 해보자.</w:t>
+        <w:t xml:space="preserve">이 문장을 선택하고 ⌘K로</w:t>
+      </w:r>
+      <w:r>
+        <w:t xml:space="preserve"> </w:t>
+      </w:r>
+      <w:r>
+        <w:t xml:space="preserve">“두 문장으로 나눠서 간결하게”</w:t>
+      </w:r>
+      <w:r>
+        <w:t xml:space="preserve">를 시켜보자.</w:t>
       </w:r>
     </w:p>
+    <w:bookmarkEnd w:id="10"/>
+    <w:bookmarkEnd w:id="11"/>
     <w:sectPr>
       <w:footnotePr>
         <w:numRestart w:val="eachSect"/>

</xml_diff>